<commit_message>
docs: document the logging finding, add the report builder, refresh numbers
- README and REPORT now explain why validation failures are logged without a
  traceback, since the reasoning is the interesting part, not the one-line fix
- docs/report-builder/ generates the .docx from REPORT.md, so the Word
  deliverable is reproducible rather than hand-formatted
- test counts and eval metrics updated to the current measured values
</commit_message>
<xml_diff>
--- a/docs/Eximion_Test_Assignment_Sergei_Kutushev.docx
+++ b/docs/Eximion_Test_Assignment_Sergei_Kutushev.docx
@@ -54,7 +54,7 @@
         </w:rPr>
         <w:t xml:space="preserve">  ·  October 2026  ·  Repository: </w:t>
       </w:r>
-      <w:hyperlink w:history="1" r:id="rIdbgkih2kq65esgozxfhocq">
+      <w:hyperlink w:history="1" r:id="rIdek_1toyztu8_khxlbryqo">
         <w:r>
           <w:rPr>
             <w:color w:val="0B5CAD"/>
@@ -1449,7 +1449,15 @@
         <w:t xml:space="preserve">Provenance and logging. </w:t>
       </w:r>
       <w:r>
-        <w:t xml:space="preserve">The model name and prompt version travel with each extracted case; logs carry field paths and error counts, never clinical text.</w:t>
+        <w:t xml:space="preserve">The model name and prompt version travel with each extracted case; logs carry field paths and error types, never clinical text.</w:t>
+      </w:r>
+    </w:p>
+    <w:p>
+      <w:pPr>
+        <w:spacing w:after="120" w:line="276"/>
+      </w:pPr>
+      <w:r>
+        <w:t xml:space="preserve">One finding worth calling out, because it came from reviewing my own code rather than from a test: a validation failure was originally logged with logger.exception, which is the idiomatic choice and what the linter pushes you toward. But Pydantic embeds the offending input values in its error message — here, the clinical narrative — so the traceback would have written patient text into the logs, defeating the logging policy stated above. Validation failures now log field paths and error types with no exc_info, and a regression test asserts the clinical marker never reaches the log.</w:t>
       </w:r>
     </w:p>
     <w:p>
@@ -1527,7 +1535,7 @@
           <w:sz w:val="19"/>
           <w:szCs w:val="19"/>
         </w:rPr>
-        <w:t xml:space="preserve">  "sex_accuracy": 1.0, "answer_key_accuracy": 0.8889, "findings_f1": 0.9907,</w:t>
+        <w:t xml:space="preserve">  "sex_accuracy": 1.0, "answer_key_accuracy": 0.8889, "findings_f1": 0.9899,</w:t>
       </w:r>
     </w:p>
     <w:p>
@@ -2121,7 +2129,7 @@
                 <w:sz w:val="20"/>
                 <w:szCs w:val="20"/>
               </w:rPr>
-              <w:t xml:space="preserve">47 passed, coverage 93.92% (gate 85%)</w:t>
+              <w:t xml:space="preserve">48 passed, coverage 93.92% (gate 85%)</w:t>
             </w:r>
           </w:p>
         </w:tc>
@@ -3016,7 +3024,7 @@
       <w:pPr>
         <w:spacing w:after="120" w:line="276"/>
       </w:pPr>
-      <w:hyperlink w:history="1" r:id="rIdjocns7puriu_b_zjldzgv">
+      <w:hyperlink w:history="1" r:id="rIdga48-9915ftvdrcqs8dix">
         <w:r>
           <w:rPr>
             <w:color w:val="0B5CAD"/>

</xml_diff>

<commit_message>
docs: explain the decision layer and the move to our own models
docs/DECISION_MODEL_MIGRATION.md covers why bounded decisions should not go
through a generative model, what Jev is and is not (a hosted decision API,
not weights we can train), the rules the layer keeps, what was measured and
what was not, an honest cost estimate, and the task-by-task migration from
Jev to local models with the gate that controls each step.

The README gets a short section and the current test counts. The report and
the Word deliverable record the full v2 run and that Jev has not been run
live. The runbook shows how to give the extraction job a TypeSafe key, and
only that job.
</commit_message>
<xml_diff>
--- a/docs/Eximion_Test_Assignment_Sergei_Kutushev.docx
+++ b/docs/Eximion_Test_Assignment_Sergei_Kutushev.docx
@@ -54,7 +54,7 @@
         </w:rPr>
         <w:t xml:space="preserve">  ·  October 2026  ·  Repository: </w:t>
       </w:r>
-      <w:hyperlink w:history="1" r:id="rIdmmo3ft5luis4s0davgxod">
+      <w:hyperlink w:history="1" r:id="rIdrx30v17jrkbrbq1g350vt">
         <w:r>
           <w:rPr>
             <w:color w:val="0B5CAD"/>
@@ -2190,7 +2190,7 @@
                 <w:sz w:val="20"/>
                 <w:szCs w:val="20"/>
               </w:rPr>
-              <w:t xml:space="preserve">48 passed, coverage 93.92% (gate 85%)</w:t>
+              <w:t xml:space="preserve">112 passed, coverage 95.02% (gate 85%)</w:t>
             </w:r>
           </w:p>
         </w:tc>
@@ -2268,6 +2268,160 @@
                 <w:szCs w:val="20"/>
               </w:rPr>
               <w:t xml:space="preserve">gate passed; 4 injected defects detected</w:t>
+            </w:r>
+          </w:p>
+        </w:tc>
+      </w:tr>
+      <w:tr>
+        <w:tc>
+          <w:tcPr>
+            <w:tcW w:type="dxa" w:w="2700"/>
+            <w:tcMar>
+              <w:top w:type="dxa" w:w="80"/>
+              <w:left w:type="dxa" w:w="120"/>
+              <w:bottom w:type="dxa" w:w="80"/>
+              <w:right w:type="dxa" w:w="120"/>
+            </w:tcMar>
+          </w:tcPr>
+          <w:p>
+            <w:pPr>
+              <w:spacing w:after="0" w:line="240"/>
+            </w:pPr>
+            <w:r>
+              <w:rPr>
+                <w:b w:val="false"/>
+                <w:bCs w:val="false"/>
+                <w:sz w:val="20"/>
+                <w:szCs w:val="20"/>
+              </w:rPr>
+              <w:t xml:space="preserve">Offline decision eval</w:t>
+            </w:r>
+          </w:p>
+        </w:tc>
+        <w:tc>
+          <w:tcPr>
+            <w:tcW w:type="dxa" w:w="3300"/>
+            <w:tcMar>
+              <w:top w:type="dxa" w:w="80"/>
+              <w:left w:type="dxa" w:w="120"/>
+              <w:bottom w:type="dxa" w:w="80"/>
+              <w:right w:type="dxa" w:w="120"/>
+            </w:tcMar>
+          </w:tcPr>
+          <w:p>
+            <w:pPr>
+              <w:spacing w:after="0" w:line="240"/>
+            </w:pPr>
+            <w:r>
+              <w:rPr>
+                <w:b w:val="false"/>
+                <w:bCs w:val="false"/>
+                <w:sz w:val="20"/>
+                <w:szCs w:val="20"/>
+              </w:rPr>
+              <w:t xml:space="preserve">clinical-extraction eval-decisions</w:t>
+            </w:r>
+          </w:p>
+        </w:tc>
+        <w:tc>
+          <w:tcPr>
+            <w:tcW w:type="dxa" w:w="3360"/>
+            <w:tcMar>
+              <w:top w:type="dxa" w:w="80"/>
+              <w:left w:type="dxa" w:w="120"/>
+              <w:bottom w:type="dxa" w:w="80"/>
+              <w:right w:type="dxa" w:w="120"/>
+            </w:tcMar>
+          </w:tcPr>
+          <w:p>
+            <w:pPr>
+              <w:spacing w:after="0" w:line="240"/>
+            </w:pPr>
+            <w:r>
+              <w:rPr>
+                <w:b w:val="false"/>
+                <w:bCs w:val="false"/>
+                <w:sz w:val="20"/>
+                <w:szCs w:val="20"/>
+              </w:rPr>
+              <w:t xml:space="preserve">gate passed; 2 injected verifier misjudgments detected</w:t>
+            </w:r>
+          </w:p>
+        </w:tc>
+      </w:tr>
+      <w:tr>
+        <w:tc>
+          <w:tcPr>
+            <w:tcW w:type="dxa" w:w="2700"/>
+            <w:tcMar>
+              <w:top w:type="dxa" w:w="80"/>
+              <w:left w:type="dxa" w:w="120"/>
+              <w:bottom w:type="dxa" w:w="80"/>
+              <w:right w:type="dxa" w:w="120"/>
+            </w:tcMar>
+          </w:tcPr>
+          <w:p>
+            <w:pPr>
+              <w:spacing w:after="0" w:line="240"/>
+            </w:pPr>
+            <w:r>
+              <w:rPr>
+                <w:b w:val="false"/>
+                <w:bCs w:val="false"/>
+                <w:sz w:val="20"/>
+                <w:szCs w:val="20"/>
+              </w:rPr>
+              <w:t xml:space="preserve">Live extraction eval</w:t>
+            </w:r>
+          </w:p>
+        </w:tc>
+        <w:tc>
+          <w:tcPr>
+            <w:tcW w:type="dxa" w:w="3300"/>
+            <w:tcMar>
+              <w:top w:type="dxa" w:w="80"/>
+              <w:left w:type="dxa" w:w="120"/>
+              <w:bottom w:type="dxa" w:w="80"/>
+              <w:right w:type="dxa" w:w="120"/>
+            </w:tcMar>
+          </w:tcPr>
+          <w:p>
+            <w:pPr>
+              <w:spacing w:after="0" w:line="240"/>
+            </w:pPr>
+            <w:r>
+              <w:rPr>
+                <w:b w:val="false"/>
+                <w:bCs w:val="false"/>
+                <w:sz w:val="20"/>
+                <w:szCs w:val="20"/>
+              </w:rPr>
+              <w:t xml:space="preserve">clinical-extraction eval --provider gemini --delay 7</w:t>
+            </w:r>
+          </w:p>
+        </w:tc>
+        <w:tc>
+          <w:tcPr>
+            <w:tcW w:type="dxa" w:w="3360"/>
+            <w:tcMar>
+              <w:top w:type="dxa" w:w="80"/>
+              <w:left w:type="dxa" w:w="120"/>
+              <w:bottom w:type="dxa" w:w="80"/>
+              <w:right w:type="dxa" w:w="120"/>
+            </w:tcMar>
+          </w:tcPr>
+          <w:p>
+            <w:pPr>
+              <w:spacing w:after="0" w:line="240"/>
+            </w:pPr>
+            <w:r>
+              <w:rPr>
+                <w:b w:val="false"/>
+                <w:bCs w:val="false"/>
+                <w:sz w:val="20"/>
+                <w:szCs w:val="20"/>
+              </w:rPr>
+              <w:t xml:space="preserve">extract-v2, 10/10 scored</w:t>
             </w:r>
           </w:p>
         </w:tc>
@@ -2863,10 +3017,10 @@
           <w:b/>
           <w:bCs/>
         </w:rPr>
-        <w:t xml:space="preserve">A complete Gemini eval run of the current prompt. </w:t>
-      </w:r>
-      <w:r>
-        <w:t xml:space="preserve">The pipeline was run against the live Gemini API, and the result is committed as produced in evals/results/gemini-2.5-flash-extract-v1.json. Two caveats, both in the file name. It is partial: the run used a free tier whose quota is exhausted partway through ten cases, so two cases were scored and eight are recorded as provider errors. And it measures extract-v1: the prompt has since moved to extract-v2, which removed score_weight from the model's output, and that version has not been run live for the same quota reason. The v2 change narrows what the model produces rather than adding to it, and it is covered by the offline eval and the stubbed-SDK tests, but I am not presenting the v1 numbers as a measurement of the current prompt. A full measurement needs a paid tier or a Vertex project.</w:t>
+        <w:t xml:space="preserve">Jev (TypeSafe) live. </w:t>
+      </w:r>
+      <w:r>
+        <w:t xml:space="preserve">The decision layer added after the interview is tested against the real TypeSafe SDK with a mocked HTTP layer, and its eval runs offline. No TypeSafe key was available, so there is no live Jev measurement yet. See docs/DECISION_MODEL_MIGRATION.md.</w:t>
       </w:r>
     </w:p>
     <w:p>
@@ -2874,7 +3028,22 @@
         <w:spacing w:after="120" w:line="276"/>
       </w:pPr>
       <w:r>
-        <w:t xml:space="preserve">The live run was worth doing: it found two faults the offline harness could not.</w:t>
+        <w:rPr>
+          <w:b/>
+          <w:bCs/>
+        </w:rPr>
+        <w:t xml:space="preserve">Since executed: </w:t>
+      </w:r>
+      <w:r>
+        <w:t xml:space="preserve">a complete live run of the current prompt, extract-v2, all ten cases, committed as evals/results/gemini-2.5-flash-extract-v2.json: schema 10/10, age and sex 1.0, answer key 0.9, findings F1 0.51 by token overlap, category accuracy 0.97, latency p50 4.0 s. The earlier extract-v1 file is kept as it was: a partial free-tier run of two cases.</w:t>
+      </w:r>
+    </w:p>
+    <w:p>
+      <w:pPr>
+        <w:spacing w:after="120" w:line="276"/>
+      </w:pPr>
+      <w:r>
+        <w:t xml:space="preserve">The first live run was worth doing: it found two faults the offline harness could not.</w:t>
       </w:r>
     </w:p>
     <w:p>
@@ -3032,7 +3201,7 @@
       <w:pPr>
         <w:spacing w:after="120" w:line="276"/>
       </w:pPr>
-      <w:hyperlink w:history="1" r:id="rIdjdp07wiemdu836cudb-ka">
+      <w:hyperlink w:history="1" r:id="rIdwuy1ncahlefwj_wvwp9tl">
         <w:r>
           <w:rPr>
             <w:color w:val="0B5CAD"/>

</xml_diff>

<commit_message>
docs: tighten the decision layer wording to what is proven
Jev is described as the primary verifier when verification is enabled, not
as something that runs today. The cost of Jev is marked as an estimate until
a live run. "Four questions" becomes five kinds of check sent as one batch
per case, sized by the case. The note on patient data no longer assumes a
BAA exists: synthetic data only, unless a privacy and security review
confirms PHI use and the contractual controls are in place.

Also documents the new completeness check, the leak rule, the provider call
plan, model provenance, the out-of-distribution guard, and that Jev's
answers are never used as training data. Test counts and the Word report
follow.
</commit_message>
<xml_diff>
--- a/docs/Eximion_Test_Assignment_Sergei_Kutushev.docx
+++ b/docs/Eximion_Test_Assignment_Sergei_Kutushev.docx
@@ -54,7 +54,7 @@
         </w:rPr>
         <w:t xml:space="preserve">  ·  October 2026  ·  Repository: </w:t>
       </w:r>
-      <w:hyperlink w:history="1" r:id="rIdrx30v17jrkbrbq1g350vt">
+      <w:hyperlink w:history="1" r:id="rIdiir-3oht-0vmvsxmrbbl1">
         <w:r>
           <w:rPr>
             <w:color w:val="0B5CAD"/>
@@ -2190,7 +2190,7 @@
                 <w:sz w:val="20"/>
                 <w:szCs w:val="20"/>
               </w:rPr>
-              <w:t xml:space="preserve">112 passed, coverage 95.02% (gate 85%)</w:t>
+              <w:t xml:space="preserve">120 passed, coverage 95.07% (gate 85%)</w:t>
             </w:r>
           </w:p>
         </w:tc>
@@ -3201,7 +3201,7 @@
       <w:pPr>
         <w:spacing w:after="120" w:line="276"/>
       </w:pPr>
-      <w:hyperlink w:history="1" r:id="rIdwuy1ncahlefwj_wvwp9tl">
+      <w:hyperlink w:history="1" r:id="rIdasofme_ohjkduef-9wx9g">
         <w:r>
           <w:rPr>
             <w:color w:val="0B5CAD"/>

</xml_diff>

<commit_message>
docs: make the runbook's Jev step complete
A secret alone did not turn Jev on: the extraction job still ran the Gemini
eval. The runbook now deploys the verifier eval as its own job, says how to
point it at a gateway, and states plainly that verifying real extractions
needs an input path for the clinical text, which belongs to the review
workflow and is not designed yet.

The migration doc records the versioned OOD threshold, the hash split for
new data, and the new gate criterion. Test counts and the Word report follow.
</commit_message>
<xml_diff>
--- a/docs/Eximion_Test_Assignment_Sergei_Kutushev.docx
+++ b/docs/Eximion_Test_Assignment_Sergei_Kutushev.docx
@@ -54,7 +54,7 @@
         </w:rPr>
         <w:t xml:space="preserve">  ·  October 2026  ·  Repository: </w:t>
       </w:r>
-      <w:hyperlink w:history="1" r:id="rIdiir-3oht-0vmvsxmrbbl1">
+      <w:hyperlink w:history="1" r:id="rIddyzgbb_kgjn7ypmbqrvet">
         <w:r>
           <w:rPr>
             <w:color w:val="0B5CAD"/>
@@ -2190,7 +2190,7 @@
                 <w:sz w:val="20"/>
                 <w:szCs w:val="20"/>
               </w:rPr>
-              <w:t xml:space="preserve">120 passed, coverage 95.07% (gate 85%)</w:t>
+              <w:t xml:space="preserve">128 passed, coverage 95.47% (gate 85%)</w:t>
             </w:r>
           </w:p>
         </w:tc>
@@ -3201,7 +3201,7 @@
       <w:pPr>
         <w:spacing w:after="120" w:line="276"/>
       </w:pPr>
-      <w:hyperlink w:history="1" r:id="rIdasofme_ohjkduef-9wx9g">
+      <w:hyperlink w:history="1" r:id="rIdggu1b21aiqy5xfxycqqjq">
         <w:r>
           <w:rPr>
             <w:color w:val="0B5CAD"/>

</xml_diff>

<commit_message>
docs: record the simulated runs and the blocked live attempt
The live attempt reached Jev's endpoint through Vercel AI Gateway and was
refused for billing; the doc says so, and notes that every candidate went to
review while the provider refused. The simulated chain run, the end-to-end
case with real Gemini, and the review-load table are added and labelled as
simulation throughout. Test counts and the Word report follow.
</commit_message>
<xml_diff>
--- a/docs/Eximion_Test_Assignment_Sergei_Kutushev.docx
+++ b/docs/Eximion_Test_Assignment_Sergei_Kutushev.docx
@@ -54,7 +54,7 @@
         </w:rPr>
         <w:t xml:space="preserve">  ·  October 2026  ·  Repository: </w:t>
       </w:r>
-      <w:hyperlink w:history="1" r:id="rIddyzgbb_kgjn7ypmbqrvet">
+      <w:hyperlink w:history="1" r:id="rIdleyu5g3qquntkhwcrgdri">
         <w:r>
           <w:rPr>
             <w:color w:val="0B5CAD"/>
@@ -2190,7 +2190,7 @@
                 <w:sz w:val="20"/>
                 <w:szCs w:val="20"/>
               </w:rPr>
-              <w:t xml:space="preserve">128 passed, coverage 95.47% (gate 85%)</w:t>
+              <w:t xml:space="preserve">135 passed, coverage 95.42% (gate 85%)</w:t>
             </w:r>
           </w:p>
         </w:tc>
@@ -3201,7 +3201,7 @@
       <w:pPr>
         <w:spacing w:after="120" w:line="276"/>
       </w:pPr>
-      <w:hyperlink w:history="1" r:id="rIdggu1b21aiqy5xfxycqqjq">
+      <w:hyperlink w:history="1" r:id="rIdch4ydqsafyynwi7arfi5h">
         <w:r>
           <w:rPr>
             <w:color w:val="0B5CAD"/>

</xml_diff>